<commit_message>
chore(documents): commit unified {{ }} Agreement template
The Agreement template was hand-converted from [Bracketed Phrase] to
{{TOKEN}} placeholders between Phase 1 and Phase 2 (24 tokens, all
verified in chat). The conversion sat in the working tree but never
got committed; Phase 2's render config assumes {{ }} delimiters, so
the deployed Documents feature would have errored on the bracketed
file shipped by d8d5b7f.

Commit content: the swapped binary only.

Co-Authored-By: Claude Opus 4.7 <noreply@anthropic.com>
</commit_message>
<xml_diff>
--- a/src/lib/documents/templates/Fourpie_Labs_Client_Agreement_TEMPLATE.docx
+++ b/src/lib/documents/templates/Fourpie_Labs_Client_Agreement_TEMPLATE.docx
@@ -119,7 +119,7 @@
           <w:sz w:val="21"/>
           <w:szCs w:val="21"/>
         </w:rPr>
-        <w:t xml:space="preserve">[GOVERNING STATE / COUNTRY]</w:t>
+        <w:t xml:space="preserve">{{GOVERNING_LAW}}</w:t>
       </w:r>
     </w:p>
     <w:p>
@@ -284,7 +284,7 @@
                 <w:sz w:val="21"/>
                 <w:szCs w:val="21"/>
               </w:rPr>
-              <w:t xml:space="preserve">[Client Full Legal Name]</w:t>
+              <w:t xml:space="preserve">{{CLIENT_LEGAL_NAME}}</w:t>
             </w:r>
           </w:p>
           <w:p>
@@ -308,7 +308,7 @@
                 <w:sz w:val="21"/>
                 <w:szCs w:val="21"/>
               </w:rPr>
-              <w:t xml:space="preserve">[Client Business Name]</w:t>
+              <w:t xml:space="preserve">{{CLIENT_BUSINESS_NAME}}</w:t>
             </w:r>
           </w:p>
           <w:p>
@@ -332,7 +332,7 @@
                 <w:sz w:val="21"/>
                 <w:szCs w:val="21"/>
               </w:rPr>
-              <w:t xml:space="preserve">[Client Address]</w:t>
+              <w:t xml:space="preserve">{{CLIENT_ADDRESS}}</w:t>
             </w:r>
           </w:p>
           <w:p>
@@ -398,15 +398,7 @@
                 <w:sz w:val="21"/>
                 <w:szCs w:val="21"/>
               </w:rPr>
-              <w:t xml:space="preserve">Trading as: </w:t>
-            </w:r>
-            <w:r>
-              <w:rPr>
-                <w:rFonts w:ascii="Arial" w:cs="Arial" w:eastAsia="Arial" w:hAnsi="Arial"/>
-                <w:sz w:val="21"/>
-                <w:szCs w:val="21"/>
-              </w:rPr>
-              <w:t xml:space="preserve">4Pie Labs</w:t>
+              <w:t>Trading as: 4Pie Labs</w:t>
             </w:r>
           </w:p>
           <w:p>
@@ -419,15 +411,7 @@
                 <w:sz w:val="21"/>
                 <w:szCs w:val="21"/>
               </w:rPr>
-              <w:t xml:space="preserve">Contact: </w:t>
-            </w:r>
-            <w:r>
-              <w:rPr>
-                <w:rFonts w:ascii="Arial" w:cs="Arial" w:eastAsia="Arial" w:hAnsi="Arial"/>
-                <w:sz w:val="21"/>
-                <w:szCs w:val="21"/>
-              </w:rPr>
-              <w:t xml:space="preserve">team@fourpielabs.com</w:t>
+              <w:t>Contact: team@fourpielabs.com</w:t>
             </w:r>
           </w:p>
           <w:p>
@@ -1691,7 +1675,7 @@
           <w:sz w:val="21"/>
           <w:szCs w:val="21"/>
         </w:rPr>
-        <w:t xml:space="preserve">[3] Business Days</w:t>
+        <w:t xml:space="preserve">{{APPROVAL_DAYS}} Business Days</w:t>
       </w:r>
       <w:r>
         <w:rPr>
@@ -2955,7 +2939,7 @@
           <w:sz w:val="21"/>
           <w:szCs w:val="21"/>
         </w:rPr>
-        <w:t xml:space="preserve">[GOVERNING STATE / COUNTRY]</w:t>
+        <w:t xml:space="preserve">{{GOVERNING_LAW}}</w:t>
       </w:r>
       <w:r>
         <w:rPr>
@@ -3100,7 +3084,7 @@
                 <w:sz w:val="21"/>
                 <w:szCs w:val="21"/>
               </w:rPr>
-              <w:t xml:space="preserve">[Client Full Legal Name]</w:t>
+              <w:t xml:space="preserve">{{CLIENT_LEGAL_NAME}}</w:t>
             </w:r>
           </w:p>
           <w:p>
@@ -3124,7 +3108,7 @@
                 <w:sz w:val="21"/>
                 <w:szCs w:val="21"/>
               </w:rPr>
-              <w:t xml:space="preserve">[ ___ ]</w:t>
+              <w:t xml:space="preserve">{{CLIENT_SIGNATORY_TITLE}}</w:t>
             </w:r>
           </w:p>
           <w:p>
@@ -3145,7 +3129,7 @@
                 <w:sz w:val="21"/>
                 <w:szCs w:val="21"/>
               </w:rPr>
-              <w:t xml:space="preserve">[ ___ ]</w:t>
+              <w:t xml:space="preserve">{{CLIENT_SIGN_DATE}}</w:t>
             </w:r>
           </w:p>
         </w:tc>
@@ -3233,7 +3217,7 @@
                 <w:sz w:val="21"/>
                 <w:szCs w:val="21"/>
               </w:rPr>
-              <w:t xml:space="preserve">[Authorised Signatory]</w:t>
+              <w:t xml:space="preserve">{{AUTHORISED_SIGNATORY}}</w:t>
             </w:r>
           </w:p>
           <w:p>
@@ -3257,7 +3241,7 @@
                 <w:sz w:val="21"/>
                 <w:szCs w:val="21"/>
               </w:rPr>
-              <w:t xml:space="preserve">[ ___ ]</w:t>
+              <w:t xml:space="preserve">{{AGENCY_SIGNATORY_TITLE}}</w:t>
             </w:r>
           </w:p>
           <w:p>
@@ -3278,7 +3262,7 @@
                 <w:sz w:val="21"/>
                 <w:szCs w:val="21"/>
               </w:rPr>
-              <w:t xml:space="preserve">[ ___ ]</w:t>
+              <w:t xml:space="preserve">{{AGENCY_SIGN_DATE}}</w:t>
             </w:r>
           </w:p>
         </w:tc>
@@ -3400,7 +3384,7 @@
                 <w:sz w:val="21"/>
                 <w:szCs w:val="21"/>
               </w:rPr>
-              <w:t xml:space="preserve">[Core / Pipeline / Operating System / Pulse]</w:t>
+              <w:t xml:space="preserve">{{PROGRAM}}</w:t>
             </w:r>
           </w:p>
         </w:tc>
@@ -3463,7 +3447,7 @@
                 <w:sz w:val="21"/>
                 <w:szCs w:val="21"/>
               </w:rPr>
-              <w:t xml:space="preserve">[$ amount per month]</w:t>
+              <w:t xml:space="preserve">{{MONTHLY_FEE}}</w:t>
             </w:r>
           </w:p>
         </w:tc>
@@ -3534,7 +3518,7 @@
                 <w:sz w:val="21"/>
                 <w:szCs w:val="21"/>
               </w:rPr>
-              <w:t xml:space="preserve">[ ___ ]</w:t>
+              <w:t xml:space="preserve">{{BILLING_DAY}}</w:t>
             </w:r>
             <w:r>
               <w:rPr>
@@ -3605,7 +3589,7 @@
                 <w:sz w:val="21"/>
                 <w:szCs w:val="21"/>
               </w:rPr>
-              <w:t xml:space="preserve">[Core: none · Pipeline/Pulse: 6 months · Operating System: 12 months]</w:t>
+              <w:t xml:space="preserve">{{MINIMUM_TERM}}</w:t>
             </w:r>
           </w:p>
         </w:tc>
@@ -3668,7 +3652,7 @@
                 <w:sz w:val="21"/>
                 <w:szCs w:val="21"/>
               </w:rPr>
-              <w:t xml:space="preserve">[DD Month YYYY]</w:t>
+              <w:t xml:space="preserve">{{START_DATE}}</w:t>
             </w:r>
           </w:p>
         </w:tc>
@@ -3731,7 +3715,7 @@
                 <w:sz w:val="21"/>
                 <w:szCs w:val="21"/>
               </w:rPr>
-              <w:t xml:space="preserve">[Client-funded directly / Pre-funded &amp; managed — $ budget]</w:t>
+              <w:t xml:space="preserve">{{AD_SPEND}}</w:t>
             </w:r>
           </w:p>
         </w:tc>
@@ -3794,7 +3778,7 @@
                 <w:sz w:val="21"/>
                 <w:szCs w:val="21"/>
               </w:rPr>
-              <w:t xml:space="preserve">[None / describe and amount]</w:t>
+              <w:t xml:space="preserve">{{SETUP_FEES}}</w:t>
             </w:r>
           </w:p>
         </w:tc>
@@ -3857,7 +3841,7 @@
                 <w:sz w:val="21"/>
                 <w:szCs w:val="21"/>
               </w:rPr>
-              <w:t xml:space="preserve">[City / region the engagement focuses on]</w:t>
+              <w:t xml:space="preserve">{{SERVICE_AREA}}</w:t>
             </w:r>
           </w:p>
         </w:tc>
@@ -4319,7 +4303,7 @@
                 <w:sz w:val="21"/>
                 <w:szCs w:val="21"/>
               </w:rPr>
-              <w:t xml:space="preserve">[Bank transfer (ACH/Wire) / Stripe / card]</w:t>
+              <w:t xml:space="preserve">{{PAYMENT_METHOD}}</w:t>
             </w:r>
           </w:p>
         </w:tc>
@@ -4382,7 +4366,7 @@
                 <w:sz w:val="21"/>
                 <w:szCs w:val="21"/>
               </w:rPr>
-              <w:t xml:space="preserve">[Fourpie Labs account name]</w:t>
+              <w:t xml:space="preserve">{{ACCOUNT_NAME}}</w:t>
             </w:r>
           </w:p>
         </w:tc>
@@ -4445,7 +4429,7 @@
                 <w:sz w:val="21"/>
                 <w:szCs w:val="21"/>
               </w:rPr>
-              <w:t xml:space="preserve">[Account number · routing number]</w:t>
+              <w:t xml:space="preserve">{{ACCOUNT_ROUTING}}</w:t>
             </w:r>
           </w:p>
         </w:tc>
@@ -4508,7 +4492,7 @@
                 <w:sz w:val="21"/>
                 <w:szCs w:val="21"/>
               </w:rPr>
-              <w:t xml:space="preserve">[Bank name]</w:t>
+              <w:t xml:space="preserve">{{BANK_NAME}}</w:t>
             </w:r>
           </w:p>
         </w:tc>
@@ -4571,7 +4555,7 @@
                 <w:sz w:val="21"/>
                 <w:szCs w:val="21"/>
               </w:rPr>
-              <w:t xml:space="preserve">[Stripe or invoice link, if used]</w:t>
+              <w:t xml:space="preserve">{{INVOICE_LINK}}</w:t>
             </w:r>
           </w:p>
         </w:tc>
@@ -4631,7 +4615,7 @@
                 <w:sz w:val="21"/>
                 <w:szCs w:val="21"/>
               </w:rPr>
-              <w:t xml:space="preserve">Retainer — [Month Year] — [Client Name]</w:t>
+              <w:t xml:space="preserve">Retainer — {{PAYMENT_REFERENCE}}</w:t>
             </w:r>
           </w:p>
         </w:tc>

</xml_diff>